<commit_message>
Reorder bullets and shorten close for B2B and B2C
Co-Authored-By: Claude Opus 5.5 <noreply@anthropic.com>
Claude-Session: https://claude.ai/code/session_01QxiGiYZoWrs63N5DrrSBU6
</commit_message>
<xml_diff>
--- a/f1run/toolkit/F1 Merge Master v7 - B2B.docx
+++ b/f1run/toolkit/F1 Merge Master v7 - B2B.docx
@@ -121,11 +121,11 @@
         <w:rPr>
           <w:b/>
         </w:rPr>
-        <w:t xml:space="preserve">Shared Values: </w:t>
+        <w:t xml:space="preserve">Market Reference: </w:t>
       </w:r>
-      <w:fldSimple w:instr=" MERGEFIELD Shared_values \* MERGEFORMAT ">
+      <w:fldSimple w:instr=" MERGEFIELD Market_reference \* MERGEFORMAT ">
         <w:r>
-          <w:t>«Shared_values»</w:t>
+          <w:t>«Market_reference»</w:t>
         </w:r>
       </w:fldSimple>
     </w:p>
@@ -143,11 +143,11 @@
         <w:rPr>
           <w:b/>
         </w:rPr>
-        <w:t xml:space="preserve">Market Reference: </w:t>
+        <w:t xml:space="preserve">Shared Values: </w:t>
       </w:r>
-      <w:fldSimple w:instr=" MERGEFIELD Market_reference \* MERGEFORMAT ">
+      <w:fldSimple w:instr=" MERGEFIELD Shared_values \* MERGEFORMAT ">
         <w:r>
-          <w:t>«Market_reference»</w:t>
+          <w:t>«Shared_values»</w:t>
         </w:r>
       </w:fldSimple>
     </w:p>
@@ -161,7 +161,7 @@
         <w:spacing w:line="360" w:lineRule="auto" w:before="0" w:after="0"/>
       </w:pPr>
       <w:r>
-        <w:t>Open to a short call to see if there is an alignment? If interested, we would love to host you at a race to show you how partners are generating ROI.</w:t>
+        <w:t>Would you be open to a quick call?</w:t>
       </w:r>
     </w:p>
     <w:p>

</xml_diff>